<commit_message>
Improve planning flow and practical Word exports
</commit_message>
<xml_diff>
--- a/assets/templates/planificacion-anual-inicial-redisenada.docx
+++ b/assets/templates/planificacion-anual-inicial-redisenada.docx
@@ -6567,349 +6567,6 @@
                 <w:sz w:val="15"/>
               </w:rPr>
               <w:t>{{PROYECTO_10_PRODUCTO}}</w:t>
-            </w:r>
-          </w:p>
-        </w:tc>
-      </w:tr>
-    </w:tbl>
-    <w:p>
-      <w:pPr>
-        <w:spacing w:after="0" w:line="252" w:lineRule="auto"/>
-        <w:rPr>
-          <w:rFonts w:ascii="Poppins" w:hAnsi="Poppins" w:cs="Poppins"/>
-        </w:rPr>
-      </w:pPr>
-      <w:r>
-        <w:rPr>
-          <w:rFonts w:ascii="Poppins" w:hAnsi="Poppins" w:cs="Poppins"/>
-        </w:rPr>
-        <w:br w:type="page"/>
-      </w:r>
-    </w:p>
-    <w:tbl>
-      <w:tblPr>
-        <w:tblW w:w="0" w:type="auto"/>
-        <w:jc w:val="center"/>
-        <w:tblLayout w:type="fixed"/>
-        <w:tblLook w:val="04A0" w:firstRow="1" w:lastRow="0" w:firstColumn="1" w:lastColumn="0" w:noHBand="0" w:noVBand="1"/>
-      </w:tblPr>
-      <w:tblGrid>
-        <w:gridCol w:w="9430"/>
-        <w:gridCol w:w="890"/>
-      </w:tblGrid>
-      <w:tr>
-        <w:trPr>
-          <w:jc w:val="center"/>
-        </w:trPr>
-        <w:tc>
-          <w:tcPr>
-            <w:tcW w:w="9430" w:type="dxa"/>
-            <w:tcBorders>
-              <w:top w:val="nil"/>
-              <w:left w:val="nil"/>
-              <w:bottom w:val="nil"/>
-              <w:right w:val="nil"/>
-            </w:tcBorders>
-            <w:tcMar>
-              <w:top w:w="20" w:type="dxa"/>
-              <w:left w:w="0" w:type="dxa"/>
-              <w:bottom w:w="20" w:type="dxa"/>
-              <w:right w:w="0" w:type="dxa"/>
-            </w:tcMar>
-          </w:tcPr>
-          <w:p>
-            <w:pPr>
-              <w:pStyle w:val="SectionTitle"/>
-              <w:spacing w:after="0" w:line="252" w:lineRule="auto"/>
-              <w:rPr>
-                <w:rFonts w:ascii="Poppins" w:hAnsi="Poppins" w:cs="Poppins"/>
-                <w:lang w:val="es-ES"/>
-              </w:rPr>
-            </w:pPr>
-            <w:r>
-              <w:rPr>
-                <w:rFonts w:ascii="Poppins" w:hAnsi="Poppins" w:cs="Poppins"/>
-                <w:lang w:val="es-ES"/>
-              </w:rPr>
-              <w:lastRenderedPageBreak/>
-              <w:t>V. CRONOGRAMA GENERAL DE PROYECTOS · CONTINUACIÓN</w:t>
-            </w:r>
-          </w:p>
-        </w:tc>
-        <w:tc>
-          <w:tcPr>
-            <w:tcW w:w="890" w:type="dxa"/>
-            <w:tcBorders>
-              <w:top w:val="nil"/>
-              <w:left w:val="nil"/>
-              <w:bottom w:val="nil"/>
-              <w:right w:val="nil"/>
-            </w:tcBorders>
-            <w:tcMar>
-              <w:top w:w="20" w:type="dxa"/>
-              <w:left w:w="0" w:type="dxa"/>
-              <w:bottom w:w="20" w:type="dxa"/>
-              <w:right w:w="0" w:type="dxa"/>
-            </w:tcMar>
-          </w:tcPr>
-          <w:p>
-            <w:pPr>
-              <w:spacing w:after="0" w:line="252" w:lineRule="auto"/>
-              <w:jc w:val="center"/>
-              <w:rPr>
-                <w:rFonts w:ascii="Poppins" w:hAnsi="Poppins" w:cs="Poppins"/>
-              </w:rPr>
-            </w:pPr>
-            <w:r>
-              <w:rPr>
-                <w:rFonts w:ascii="Poppins" w:hAnsi="Poppins" w:cs="Poppins"/>
-                <w:noProof/>
-              </w:rPr>
-              <w:drawing>
-                <wp:inline distT="0" distB="0" distL="0" distR="0" wp14:anchorId="2352412E" wp14:editId="259B5735">
-                  <wp:extent cx="438912" cy="351130"/>
-                  <wp:effectExtent l="0" t="0" r="0" b="0"/>
-                  <wp:docPr id="10" name="Picture 10"/>
-                  <wp:cNvGraphicFramePr>
-                    <a:graphicFrameLocks xmlns:a="http://schemas.openxmlformats.org/drawingml/2006/main" noChangeAspect="1"/>
-                  </wp:cNvGraphicFramePr>
-                  <a:graphic xmlns:a="http://schemas.openxmlformats.org/drawingml/2006/main">
-                    <a:graphicData uri="http://schemas.openxmlformats.org/drawingml/2006/picture">
-                      <pic:pic xmlns:pic="http://schemas.openxmlformats.org/drawingml/2006/picture">
-                        <pic:nvPicPr>
-                          <pic:cNvPr id="0" name="calendar.png"/>
-                          <pic:cNvPicPr/>
-                        </pic:nvPicPr>
-                        <pic:blipFill>
-                          <a:blip r:embed="rId13"/>
-                          <a:stretch>
-                            <a:fillRect/>
-                          </a:stretch>
-                        </pic:blipFill>
-                        <pic:spPr>
-                          <a:xfrm>
-                            <a:off x="0" y="0"/>
-                            <a:ext cx="438912" cy="351130"/>
-                          </a:xfrm>
-                          <a:prstGeom prst="rect">
-                            <a:avLst/>
-                          </a:prstGeom>
-                        </pic:spPr>
-                      </pic:pic>
-                    </a:graphicData>
-                  </a:graphic>
-                </wp:inline>
-              </w:drawing>
-            </w:r>
-          </w:p>
-        </w:tc>
-      </w:tr>
-    </w:tbl>
-    <w:p>
-      <w:pPr>
-        <w:spacing w:after="40" w:line="252" w:lineRule="auto"/>
-        <w:rPr>
-          <w:rFonts w:ascii="Poppins" w:hAnsi="Poppins" w:cs="Poppins"/>
-        </w:rPr>
-      </w:pPr>
-    </w:p>
-    <w:tbl>
-      <w:tblPr>
-        <w:tblW w:w="0" w:type="auto"/>
-        <w:jc w:val="center"/>
-        <w:tblLayout w:type="fixed"/>
-        <w:tblLook w:val="04A0" w:firstRow="1" w:lastRow="0" w:firstColumn="1" w:lastColumn="0" w:noHBand="0" w:noVBand="1"/>
-      </w:tblPr>
-      <w:tblGrid>
-        <w:gridCol w:w="700"/>
-        <w:gridCol w:w="2450"/>
-        <w:gridCol w:w="1200"/>
-        <w:gridCol w:w="1200"/>
-        <w:gridCol w:w="1350"/>
-        <w:gridCol w:w="3400"/>
-      </w:tblGrid>
-      <w:tr>
-        <w:trPr>
-          <w:tblHeader/>
-          <w:jc w:val="center"/>
-        </w:trPr>
-        <w:tc>
-          <w:tcPr>
-            <w:tcW w:w="700" w:type="dxa"/>
-            <w:shd w:val="clear" w:color="auto" w:fill="2E5B88"/>
-            <w:tcMar>
-              <w:top w:w="70" w:type="dxa"/>
-              <w:left w:w="55" w:type="dxa"/>
-              <w:bottom w:w="70" w:type="dxa"/>
-              <w:right w:w="55" w:type="dxa"/>
-            </w:tcMar>
-          </w:tcPr>
-          <w:p>
-            <w:pPr>
-              <w:spacing w:after="0" w:line="252" w:lineRule="auto"/>
-              <w:jc w:val="center"/>
-              <w:rPr>
-                <w:rFonts w:ascii="Poppins" w:hAnsi="Poppins" w:cs="Poppins"/>
-              </w:rPr>
-            </w:pPr>
-            <w:r>
-              <w:rPr>
-                <w:rFonts w:ascii="Poppins" w:hAnsi="Poppins" w:cs="Poppins"/>
-                <w:b/>
-                <w:color w:val="FFFFFF"/>
-                <w:sz w:val="16"/>
-              </w:rPr>
-              <w:t>Cod.</w:t>
-            </w:r>
-          </w:p>
-        </w:tc>
-        <w:tc>
-          <w:tcPr>
-            <w:tcW w:w="2450" w:type="dxa"/>
-            <w:shd w:val="clear" w:color="auto" w:fill="2E5B88"/>
-            <w:tcMar>
-              <w:top w:w="70" w:type="dxa"/>
-              <w:left w:w="55" w:type="dxa"/>
-              <w:bottom w:w="70" w:type="dxa"/>
-              <w:right w:w="55" w:type="dxa"/>
-            </w:tcMar>
-          </w:tcPr>
-          <w:p>
-            <w:pPr>
-              <w:spacing w:after="0" w:line="252" w:lineRule="auto"/>
-              <w:jc w:val="center"/>
-              <w:rPr>
-                <w:rFonts w:ascii="Poppins" w:hAnsi="Poppins" w:cs="Poppins"/>
-              </w:rPr>
-            </w:pPr>
-            <w:r>
-              <w:rPr>
-                <w:rFonts w:ascii="Poppins" w:hAnsi="Poppins" w:cs="Poppins"/>
-                <w:b/>
-                <w:color w:val="FFFFFF"/>
-                <w:sz w:val="16"/>
-              </w:rPr>
-              <w:t>Proyecto</w:t>
-            </w:r>
-          </w:p>
-        </w:tc>
-        <w:tc>
-          <w:tcPr>
-            <w:tcW w:w="1200" w:type="dxa"/>
-            <w:shd w:val="clear" w:color="auto" w:fill="2E5B88"/>
-            <w:tcMar>
-              <w:top w:w="70" w:type="dxa"/>
-              <w:left w:w="55" w:type="dxa"/>
-              <w:bottom w:w="70" w:type="dxa"/>
-              <w:right w:w="55" w:type="dxa"/>
-            </w:tcMar>
-          </w:tcPr>
-          <w:p>
-            <w:pPr>
-              <w:spacing w:after="0" w:line="252" w:lineRule="auto"/>
-              <w:jc w:val="center"/>
-              <w:rPr>
-                <w:rFonts w:ascii="Poppins" w:hAnsi="Poppins" w:cs="Poppins"/>
-              </w:rPr>
-            </w:pPr>
-            <w:r>
-              <w:rPr>
-                <w:rFonts w:ascii="Poppins" w:hAnsi="Poppins" w:cs="Poppins"/>
-                <w:b/>
-                <w:color w:val="FFFFFF"/>
-                <w:sz w:val="16"/>
-              </w:rPr>
-              <w:t>Inicio</w:t>
-            </w:r>
-          </w:p>
-        </w:tc>
-        <w:tc>
-          <w:tcPr>
-            <w:tcW w:w="1200" w:type="dxa"/>
-            <w:shd w:val="clear" w:color="auto" w:fill="2E5B88"/>
-            <w:tcMar>
-              <w:top w:w="70" w:type="dxa"/>
-              <w:left w:w="55" w:type="dxa"/>
-              <w:bottom w:w="70" w:type="dxa"/>
-              <w:right w:w="55" w:type="dxa"/>
-            </w:tcMar>
-          </w:tcPr>
-          <w:p>
-            <w:pPr>
-              <w:spacing w:after="0" w:line="252" w:lineRule="auto"/>
-              <w:jc w:val="center"/>
-              <w:rPr>
-                <w:rFonts w:ascii="Poppins" w:hAnsi="Poppins" w:cs="Poppins"/>
-              </w:rPr>
-            </w:pPr>
-            <w:r>
-              <w:rPr>
-                <w:rFonts w:ascii="Poppins" w:hAnsi="Poppins" w:cs="Poppins"/>
-                <w:b/>
-                <w:color w:val="FFFFFF"/>
-                <w:sz w:val="16"/>
-              </w:rPr>
-              <w:t>Fin</w:t>
-            </w:r>
-          </w:p>
-        </w:tc>
-        <w:tc>
-          <w:tcPr>
-            <w:tcW w:w="1350" w:type="dxa"/>
-            <w:shd w:val="clear" w:color="auto" w:fill="2E5B88"/>
-            <w:tcMar>
-              <w:top w:w="70" w:type="dxa"/>
-              <w:left w:w="55" w:type="dxa"/>
-              <w:bottom w:w="70" w:type="dxa"/>
-              <w:right w:w="55" w:type="dxa"/>
-            </w:tcMar>
-          </w:tcPr>
-          <w:p>
-            <w:pPr>
-              <w:spacing w:after="0" w:line="252" w:lineRule="auto"/>
-              <w:jc w:val="center"/>
-              <w:rPr>
-                <w:rFonts w:ascii="Poppins" w:hAnsi="Poppins" w:cs="Poppins"/>
-              </w:rPr>
-            </w:pPr>
-            <w:r>
-              <w:rPr>
-                <w:rFonts w:ascii="Poppins" w:hAnsi="Poppins" w:cs="Poppins"/>
-                <w:b/>
-                <w:color w:val="FFFFFF"/>
-                <w:sz w:val="16"/>
-              </w:rPr>
-              <w:t>Duración</w:t>
-            </w:r>
-          </w:p>
-        </w:tc>
-        <w:tc>
-          <w:tcPr>
-            <w:tcW w:w="3400" w:type="dxa"/>
-            <w:shd w:val="clear" w:color="auto" w:fill="2E5B88"/>
-            <w:tcMar>
-              <w:top w:w="70" w:type="dxa"/>
-              <w:left w:w="55" w:type="dxa"/>
-              <w:bottom w:w="70" w:type="dxa"/>
-              <w:right w:w="55" w:type="dxa"/>
-            </w:tcMar>
-          </w:tcPr>
-          <w:p>
-            <w:pPr>
-              <w:spacing w:after="0" w:line="252" w:lineRule="auto"/>
-              <w:jc w:val="center"/>
-              <w:rPr>
-                <w:rFonts w:ascii="Poppins" w:hAnsi="Poppins" w:cs="Poppins"/>
-              </w:rPr>
-            </w:pPr>
-            <w:r>
-              <w:rPr>
-                <w:rFonts w:ascii="Poppins" w:hAnsi="Poppins" w:cs="Poppins"/>
-                <w:b/>
-                <w:color w:val="FFFFFF"/>
-                <w:sz w:val="16"/>
-              </w:rPr>
-              <w:t>Producto o evidencia final</w:t>
             </w:r>
           </w:p>
         </w:tc>

</xml_diff>